<commit_message>
docs: add October 28 minutes and refresh meeting files
</commit_message>
<xml_diff>
--- a/Docs/会议记录/鸿毛会议模版.docx
+++ b/Docs/会议记录/鸿毛会议模版.docx
@@ -55,7 +55,7 @@
     <w:p>
       <w:pPr>
         <w:rPr>
-          <w:rFonts w:ascii="SimSun" w:eastAsia="SimSun" w:hAnsi="SimSun" w:cs="SimSun" w:hint="eastAsia"/>
+          <w:rFonts w:ascii="SimSun" w:eastAsia="SimSun" w:hAnsi="SimSun" w:cs="SimSun"/>
           <w:lang w:eastAsia="zh-CN"/>
         </w:rPr>
       </w:pPr>
@@ -67,7 +67,7 @@
           <w:sz w:val="24"/>
           <w:lang w:eastAsia="zh-CN"/>
         </w:rPr>
-        <w:t>会前准备</w:t>
+        <w:t>注意事项</w:t>
       </w:r>
       <w:r>
         <w:rPr>
@@ -101,31 +101,31 @@
           <w:numId w:val="1"/>
         </w:numPr>
         <w:rPr>
+          <w:rFonts w:ascii="SimSun" w:eastAsia="SimSun" w:hAnsi="SimSun" w:cs="SimSun"/>
+          <w:b/>
+          <w:bCs/>
+          <w:sz w:val="24"/>
+          <w:lang w:eastAsia="zh-CN"/>
+        </w:rPr>
+      </w:pPr>
+      <w:r>
+        <w:rPr>
+          <w:rFonts w:hint="eastAsia"/>
+          <w:b/>
+          <w:bCs/>
+          <w:sz w:val="24"/>
+          <w:lang w:eastAsia="zh-CN"/>
+        </w:rPr>
+        <w:t>成果</w:t>
+      </w:r>
+      <w:r>
+        <w:rPr>
           <w:rFonts w:ascii="SimSun" w:eastAsia="SimSun" w:hAnsi="SimSun" w:cs="SimSun" w:hint="eastAsia"/>
           <w:b/>
           <w:bCs/>
           <w:sz w:val="24"/>
           <w:lang w:eastAsia="zh-CN"/>
         </w:rPr>
-      </w:pPr>
-      <w:r>
-        <w:rPr>
-          <w:rFonts w:hint="eastAsia"/>
-          <w:b/>
-          <w:bCs/>
-          <w:sz w:val="24"/>
-          <w:lang w:eastAsia="zh-CN"/>
-        </w:rPr>
-        <w:t>成果</w:t>
-      </w:r>
-      <w:r>
-        <w:rPr>
-          <w:rFonts w:ascii="SimSun" w:eastAsia="SimSun" w:hAnsi="SimSun" w:cs="SimSun" w:hint="eastAsia"/>
-          <w:b/>
-          <w:bCs/>
-          <w:sz w:val="24"/>
-          <w:lang w:eastAsia="zh-CN"/>
-        </w:rPr>
         <w:t>汇报（5min）</w:t>
       </w:r>
       <w:r>
@@ -134,6 +134,19 @@
           <w:b/>
           <w:bCs/>
           <w:sz w:val="24"/>
+          <w:lang w:eastAsia="zh-CN"/>
+        </w:rPr>
+        <w:br/>
+      </w:r>
+      <w:r>
+        <w:rPr>
+          <w:rFonts w:hint="eastAsia"/>
+          <w:lang w:eastAsia="zh-CN"/>
+        </w:rPr>
+        <w:t>--</w:t>
+      </w:r>
+      <w:r>
+        <w:rPr>
           <w:lang w:eastAsia="zh-CN"/>
         </w:rPr>
         <w:br/>
@@ -187,6 +200,22 @@
         </w:rPr>
         <w:t>--</w:t>
       </w:r>
+    </w:p>
+    <w:p>
+      <w:pPr>
+        <w:pStyle w:val="a9"/>
+        <w:ind w:left="440"/>
+        <w:rPr>
+          <w:lang w:eastAsia="zh-CN"/>
+        </w:rPr>
+      </w:pPr>
+      <w:r>
+        <w:rPr>
+          <w:rFonts w:hint="eastAsia"/>
+          <w:lang w:eastAsia="zh-CN"/>
+        </w:rPr>
+        <w:t>--</w:t>
+      </w:r>
       <w:r>
         <w:rPr>
           <w:rFonts w:ascii="SimSun" w:eastAsia="SimSun" w:hAnsi="SimSun" w:cs="SimSun"/>
@@ -242,19 +271,6 @@
           <w:lang w:eastAsia="zh-CN"/>
         </w:rPr>
         <w:t>--</w:t>
-      </w:r>
-      <w:r>
-        <w:rPr>
-          <w:rFonts w:ascii="SimSun" w:eastAsia="SimSun" w:hAnsi="SimSun" w:cs="SimSun"/>
-          <w:lang w:eastAsia="zh-CN"/>
-        </w:rPr>
-        <w:br/>
-      </w:r>
-      <w:r>
-        <w:rPr>
-          <w:lang w:eastAsia="zh-CN"/>
-        </w:rPr>
-        <w:br/>
       </w:r>
     </w:p>
     <w:tbl>
@@ -334,6 +350,7 @@
               <w:spacing w:line="252" w:lineRule="auto"/>
               <w:jc w:val="center"/>
             </w:pPr>
+            <w:proofErr w:type="spellStart"/>
             <w:r>
               <w:rPr>
                 <w:rFonts w:ascii="Arial Unicode MS" w:eastAsia="Arial Unicode MS" w:hAnsi="Arial Unicode MS"/>
@@ -341,8 +358,40 @@
                 <w:color w:val="FFFFFF"/>
                 <w:sz w:val="18"/>
               </w:rPr>
-              <w:t>9月25日前交付</w:t>
+              <w:t>月日</w:t>
             </w:r>
+            <w:proofErr w:type="spellEnd"/>
+            <w:r>
+              <w:rPr>
+                <w:rFonts w:ascii="Arial Unicode MS" w:eastAsia="Arial Unicode MS" w:hAnsi="Arial Unicode MS"/>
+                <w:b/>
+                <w:color w:val="FFFFFF"/>
+                <w:sz w:val="18"/>
+                <w:lang w:eastAsia="ja-JP"/>
+              </w:rPr>
+              <w:t>()</w:t>
+            </w:r>
+            <w:r>
+              <w:rPr>
+                <w:rFonts w:ascii="Arial Unicode MS" w:eastAsia="Arial Unicode MS" w:hAnsi="Arial Unicode MS" w:hint="eastAsia"/>
+                <w:b/>
+                <w:color w:val="FFFFFF"/>
+                <w:sz w:val="18"/>
+                <w:lang w:eastAsia="ja-JP"/>
+              </w:rPr>
+              <w:t>前</w:t>
+            </w:r>
+            <w:proofErr w:type="spellStart"/>
+            <w:r>
+              <w:rPr>
+                <w:rFonts w:ascii="Arial Unicode MS" w:eastAsia="Arial Unicode MS" w:hAnsi="Arial Unicode MS"/>
+                <w:b/>
+                <w:color w:val="FFFFFF"/>
+                <w:sz w:val="18"/>
+              </w:rPr>
+              <w:t>交付</w:t>
+            </w:r>
+            <w:proofErr w:type="spellEnd"/>
           </w:p>
         </w:tc>
         <w:tc>
@@ -656,6 +705,24 @@
       </w:tr>
     </w:tbl>
     <w:p/>
+    <w:p>
+      <w:pPr>
+        <w:widowControl/>
+      </w:pPr>
+      <w:r>
+        <w:br w:type="page"/>
+      </w:r>
+    </w:p>
+    <w:p>
+      <w:r>
+        <w:rPr>
+          <w:rFonts w:hint="eastAsia"/>
+          <w:lang w:eastAsia="zh-CN"/>
+        </w:rPr>
+        <w:lastRenderedPageBreak/>
+        <w:t>--</w:t>
+      </w:r>
+    </w:p>
     <w:sectPr>
       <w:pgSz w:w="11906" w:h="16838"/>
       <w:pgMar w:top="1985" w:right="1701" w:bottom="1701" w:left="1701" w:header="851" w:footer="992" w:gutter="0"/>

</xml_diff>